<commit_message>
Validáció és kód finomítás (auth:reg,login,profile)
</commit_message>
<xml_diff>
--- a/Tesztelési jegyzőkönyv.docx
+++ b/Tesztelési jegyzőkönyv.docx
@@ -200,13 +200,8 @@
             <w:pPr>
               <w:spacing w:after="160" w:line="278" w:lineRule="auto"/>
             </w:pPr>
-            <w:proofErr w:type="spellStart"/>
-            <w:r>
-              <w:t>Token</w:t>
-            </w:r>
-            <w:proofErr w:type="spellEnd"/>
-            <w:r>
-              <w:t xml:space="preserve"> visszakapás</w:t>
+            <w:r>
+              <w:t>Token visszakapás</w:t>
             </w:r>
           </w:p>
         </w:tc>
@@ -481,29 +476,22 @@
             <w:pPr>
               <w:spacing w:after="160" w:line="278" w:lineRule="auto"/>
             </w:pPr>
-            <w:proofErr w:type="spellStart"/>
             <w:r>
               <w:t>Checkout</w:t>
             </w:r>
-            <w:proofErr w:type="spellEnd"/>
-          </w:p>
-        </w:tc>
-        <w:tc>
-          <w:tcPr>
-            <w:tcW w:w="0" w:type="auto"/>
-            <w:hideMark/>
-          </w:tcPr>
-          <w:p>
-            <w:pPr>
-              <w:spacing w:after="160" w:line="278" w:lineRule="auto"/>
-            </w:pPr>
-            <w:proofErr w:type="spellStart"/>
-            <w:r>
-              <w:t>Order</w:t>
-            </w:r>
-            <w:proofErr w:type="spellEnd"/>
-            <w:r>
-              <w:t xml:space="preserve"> létrejön DB-ben</w:t>
+          </w:p>
+        </w:tc>
+        <w:tc>
+          <w:tcPr>
+            <w:tcW w:w="0" w:type="auto"/>
+            <w:hideMark/>
+          </w:tcPr>
+          <w:p>
+            <w:pPr>
+              <w:spacing w:after="160" w:line="278" w:lineRule="auto"/>
+            </w:pPr>
+            <w:r>
+              <w:t>Order létrejön DB-ben</w:t>
             </w:r>
           </w:p>
         </w:tc>
@@ -532,13 +520,8 @@
             <w:pPr>
               <w:spacing w:after="160" w:line="278" w:lineRule="auto"/>
             </w:pPr>
-            <w:proofErr w:type="spellStart"/>
-            <w:r>
-              <w:t>Admin</w:t>
-            </w:r>
-            <w:proofErr w:type="spellEnd"/>
-            <w:r>
-              <w:t xml:space="preserve"> törlés</w:t>
+            <w:r>
+              <w:t>Admin törlés</w:t>
             </w:r>
           </w:p>
         </w:tc>
@@ -595,43 +578,22 @@
             <w:pPr>
               <w:spacing w:after="160" w:line="278" w:lineRule="auto"/>
             </w:pPr>
-            <w:proofErr w:type="spellStart"/>
-            <w:r>
-              <w:t>Token</w:t>
-            </w:r>
-            <w:proofErr w:type="spellEnd"/>
-            <w:r>
-              <w:t xml:space="preserve"> védelem</w:t>
-            </w:r>
-          </w:p>
-        </w:tc>
-        <w:tc>
-          <w:tcPr>
-            <w:tcW w:w="0" w:type="auto"/>
-            <w:hideMark/>
-          </w:tcPr>
-          <w:p>
-            <w:pPr>
-              <w:spacing w:after="160" w:line="278" w:lineRule="auto"/>
-            </w:pPr>
-            <w:r>
-              <w:t>/</w:t>
-            </w:r>
-            <w:proofErr w:type="spellStart"/>
-            <w:r>
-              <w:t>admin</w:t>
-            </w:r>
-            <w:proofErr w:type="spellEnd"/>
-            <w:r>
-              <w:t xml:space="preserve"> hívás </w:t>
-            </w:r>
-            <w:proofErr w:type="spellStart"/>
-            <w:r>
-              <w:t>token</w:t>
-            </w:r>
-            <w:proofErr w:type="spellEnd"/>
-            <w:r>
-              <w:t xml:space="preserve"> nélkül</w:t>
+            <w:r>
+              <w:t>Token védelem</w:t>
+            </w:r>
+          </w:p>
+        </w:tc>
+        <w:tc>
+          <w:tcPr>
+            <w:tcW w:w="0" w:type="auto"/>
+            <w:hideMark/>
+          </w:tcPr>
+          <w:p>
+            <w:pPr>
+              <w:spacing w:after="160" w:line="278" w:lineRule="auto"/>
+            </w:pPr>
+            <w:r>
+              <w:t>/admin hívás token nélkül</w:t>
             </w:r>
           </w:p>
         </w:tc>
@@ -739,6 +701,779 @@
         <w:t>nem létező ID</w:t>
       </w:r>
     </w:p>
+    <w:p/>
+    <w:p/>
+    <w:p/>
+    <w:p/>
+    <w:p/>
+    <w:p/>
+    <w:p/>
+    <w:p/>
+    <w:p/>
+    <w:p/>
+    <w:p>
+      <w:r>
+        <w:lastRenderedPageBreak/>
+        <w:t>Regisztráció:</w:t>
+      </w:r>
+    </w:p>
+    <w:p>
+      <w:r>
+        <w:t>tesztelni:</w:t>
+      </w:r>
+    </w:p>
+    <w:p>
+      <w:r>
+        <w:t>Minden mező kitöltése kötelező</w:t>
+      </w:r>
+    </w:p>
+    <w:p>
+      <w:r>
+        <w:t>név nem lehet 4-nél kisebb 100-nál nagyobb</w:t>
+      </w:r>
+    </w:p>
+    <w:p>
+      <w:r>
+        <w:t>email nem lehet max 100</w:t>
+      </w:r>
+    </w:p>
+    <w:p>
+      <w:r>
+        <w:t>jelszó max 100</w:t>
+      </w:r>
+    </w:p>
+    <w:p>
+      <w:r>
+        <w:t>email csak egy @ tartalmazhat a záró „.hu” rész min 2 karakter. Első karakter nem lehet space és vagy @.</w:t>
+      </w:r>
+    </w:p>
+    <w:p>
+      <w:r>
+        <w:t>Jelszónak tartalmaznia kell kis és nagy betüket számot és karaktert. Min hossz: 8</w:t>
+      </w:r>
+      <w:r>
+        <w:br/>
+        <w:t>Minden mező kitöltése kötelező</w:t>
+      </w:r>
+    </w:p>
+    <w:p>
+      <w:r>
+        <w:t>Telefonszám nem tartalmazhat csak számot és egy + jelet az elején</w:t>
+      </w:r>
+    </w:p>
+    <w:p>
+      <w:r>
+        <w:t>irányítószám csak 4 karakter és csak szám</w:t>
+      </w:r>
+    </w:p>
+    <w:p>
+      <w:r>
+        <w:t>Város nem tartalmazhat karaktereket és vagy számokat hossza max 50</w:t>
+      </w:r>
+    </w:p>
+    <w:p>
+      <w:r>
+        <w:t xml:space="preserve">A cím nem tartalmazhat karaktereket kivéve: </w:t>
+      </w:r>
+      <w:r>
+        <w:t>._,-</w:t>
+      </w:r>
+      <w:r>
+        <w:t xml:space="preserve"> hossza max 100</w:t>
+      </w:r>
+    </w:p>
+    <w:tbl>
+      <w:tblPr>
+        <w:tblStyle w:val="Rcsostblzat"/>
+        <w:tblW w:w="0" w:type="auto"/>
+        <w:tblLook w:val="04A0" w:firstRow="1" w:lastRow="0" w:firstColumn="1" w:lastColumn="0" w:noHBand="0" w:noVBand="1"/>
+      </w:tblPr>
+      <w:tblGrid>
+        <w:gridCol w:w="1599"/>
+        <w:gridCol w:w="2862"/>
+        <w:gridCol w:w="3284"/>
+        <w:gridCol w:w="1317"/>
+      </w:tblGrid>
+      <w:tr>
+        <w:tc>
+          <w:tcPr>
+            <w:tcW w:w="0" w:type="auto"/>
+            <w:hideMark/>
+          </w:tcPr>
+          <w:p>
+            <w:pPr>
+              <w:spacing w:after="160" w:line="278" w:lineRule="auto"/>
+              <w:rPr>
+                <w:b/>
+                <w:bCs/>
+              </w:rPr>
+            </w:pPr>
+            <w:r>
+              <w:rPr>
+                <w:b/>
+                <w:bCs/>
+              </w:rPr>
+              <w:t>Teszt neve</w:t>
+            </w:r>
+          </w:p>
+        </w:tc>
+        <w:tc>
+          <w:tcPr>
+            <w:tcW w:w="0" w:type="auto"/>
+            <w:hideMark/>
+          </w:tcPr>
+          <w:p>
+            <w:pPr>
+              <w:spacing w:after="160" w:line="278" w:lineRule="auto"/>
+              <w:rPr>
+                <w:b/>
+                <w:bCs/>
+              </w:rPr>
+            </w:pPr>
+            <w:r>
+              <w:rPr>
+                <w:b/>
+                <w:bCs/>
+              </w:rPr>
+              <w:t>Leírás</w:t>
+            </w:r>
+          </w:p>
+        </w:tc>
+        <w:tc>
+          <w:tcPr>
+            <w:tcW w:w="0" w:type="auto"/>
+            <w:hideMark/>
+          </w:tcPr>
+          <w:p>
+            <w:pPr>
+              <w:spacing w:after="160" w:line="278" w:lineRule="auto"/>
+              <w:rPr>
+                <w:b/>
+                <w:bCs/>
+              </w:rPr>
+            </w:pPr>
+            <w:r>
+              <w:rPr>
+                <w:b/>
+                <w:bCs/>
+              </w:rPr>
+              <w:t>Elvárt eredmény</w:t>
+            </w:r>
+          </w:p>
+        </w:tc>
+        <w:tc>
+          <w:tcPr>
+            <w:tcW w:w="0" w:type="auto"/>
+            <w:hideMark/>
+          </w:tcPr>
+          <w:p>
+            <w:pPr>
+              <w:spacing w:after="160" w:line="278" w:lineRule="auto"/>
+              <w:rPr>
+                <w:b/>
+                <w:bCs/>
+              </w:rPr>
+            </w:pPr>
+            <w:r>
+              <w:rPr>
+                <w:b/>
+                <w:bCs/>
+              </w:rPr>
+              <w:t>Eredmény</w:t>
+            </w:r>
+          </w:p>
+        </w:tc>
+      </w:tr>
+      <w:tr>
+        <w:tc>
+          <w:tcPr>
+            <w:tcW w:w="0" w:type="auto"/>
+            <w:hideMark/>
+          </w:tcPr>
+          <w:p>
+            <w:pPr>
+              <w:spacing w:after="160" w:line="278" w:lineRule="auto"/>
+            </w:pPr>
+            <w:r>
+              <w:t>REG01</w:t>
+            </w:r>
+          </w:p>
+        </w:tc>
+        <w:tc>
+          <w:tcPr>
+            <w:tcW w:w="0" w:type="auto"/>
+            <w:hideMark/>
+          </w:tcPr>
+          <w:p>
+            <w:pPr>
+              <w:spacing w:after="160" w:line="278" w:lineRule="auto"/>
+            </w:pPr>
+            <w:r>
+              <w:t>Név + email + jelszó</w:t>
+            </w:r>
+          </w:p>
+        </w:tc>
+        <w:tc>
+          <w:tcPr>
+            <w:tcW w:w="0" w:type="auto"/>
+            <w:hideMark/>
+          </w:tcPr>
+          <w:p>
+            <w:pPr>
+              <w:spacing w:after="160" w:line="278" w:lineRule="auto"/>
+            </w:pPr>
+            <w:r>
+              <w:t>Sikeres regisztráció</w:t>
+            </w:r>
+          </w:p>
+        </w:tc>
+        <w:tc>
+          <w:tcPr>
+            <w:tcW w:w="0" w:type="auto"/>
+            <w:hideMark/>
+          </w:tcPr>
+          <w:p>
+            <w:pPr>
+              <w:spacing w:after="160" w:line="278" w:lineRule="auto"/>
+            </w:pPr>
+            <w:r>
+              <w:t>OK</w:t>
+            </w:r>
+          </w:p>
+        </w:tc>
+      </w:tr>
+      <w:tr>
+        <w:tc>
+          <w:tcPr>
+            <w:tcW w:w="0" w:type="auto"/>
+          </w:tcPr>
+          <w:p>
+            <w:r>
+              <w:t>REG02</w:t>
+            </w:r>
+          </w:p>
+        </w:tc>
+        <w:tc>
+          <w:tcPr>
+            <w:tcW w:w="0" w:type="auto"/>
+          </w:tcPr>
+          <w:p>
+            <w:r>
+              <w:t>Valamelyik mező üres</w:t>
+            </w:r>
+          </w:p>
+        </w:tc>
+        <w:tc>
+          <w:tcPr>
+            <w:tcW w:w="0" w:type="auto"/>
+          </w:tcPr>
+          <w:p>
+            <w:r>
+              <w:t>Hiba: Minden mező kitöltése kötelező!</w:t>
+            </w:r>
+          </w:p>
+        </w:tc>
+        <w:tc>
+          <w:tcPr>
+            <w:tcW w:w="0" w:type="auto"/>
+          </w:tcPr>
+          <w:p>
+            <w:r>
+              <w:t>OK</w:t>
+            </w:r>
+          </w:p>
+        </w:tc>
+      </w:tr>
+      <w:tr>
+        <w:tc>
+          <w:tcPr>
+            <w:tcW w:w="0" w:type="auto"/>
+            <w:hideMark/>
+          </w:tcPr>
+          <w:p>
+            <w:pPr>
+              <w:spacing w:after="160" w:line="278" w:lineRule="auto"/>
+            </w:pPr>
+            <w:r>
+              <w:t>REG0</w:t>
+            </w:r>
+            <w:r>
+              <w:t>3</w:t>
+            </w:r>
+          </w:p>
+        </w:tc>
+        <w:tc>
+          <w:tcPr>
+            <w:tcW w:w="0" w:type="auto"/>
+            <w:hideMark/>
+          </w:tcPr>
+          <w:p>
+            <w:pPr>
+              <w:spacing w:after="160" w:line="278" w:lineRule="auto"/>
+            </w:pPr>
+            <w:r>
+              <w:t>Létező email használata</w:t>
+            </w:r>
+          </w:p>
+        </w:tc>
+        <w:tc>
+          <w:tcPr>
+            <w:tcW w:w="0" w:type="auto"/>
+            <w:hideMark/>
+          </w:tcPr>
+          <w:p>
+            <w:pPr>
+              <w:spacing w:after="160" w:line="278" w:lineRule="auto"/>
+            </w:pPr>
+            <w:r>
+              <w:t>Hiba: Email foglalt!</w:t>
+            </w:r>
+          </w:p>
+        </w:tc>
+        <w:tc>
+          <w:tcPr>
+            <w:tcW w:w="0" w:type="auto"/>
+            <w:hideMark/>
+          </w:tcPr>
+          <w:p>
+            <w:pPr>
+              <w:spacing w:after="160" w:line="278" w:lineRule="auto"/>
+            </w:pPr>
+            <w:r>
+              <w:t>OK</w:t>
+            </w:r>
+          </w:p>
+        </w:tc>
+      </w:tr>
+      <w:tr>
+        <w:tc>
+          <w:tcPr>
+            <w:tcW w:w="0" w:type="auto"/>
+            <w:hideMark/>
+          </w:tcPr>
+          <w:p>
+            <w:pPr>
+              <w:spacing w:after="160" w:line="278" w:lineRule="auto"/>
+              <w:rPr>
+                <w:i/>
+                <w:iCs/>
+              </w:rPr>
+            </w:pPr>
+            <w:r>
+              <w:rPr>
+                <w:i/>
+                <w:iCs/>
+              </w:rPr>
+              <w:t>REG0</w:t>
+            </w:r>
+            <w:r>
+              <w:rPr>
+                <w:i/>
+                <w:iCs/>
+              </w:rPr>
+              <w:t>4</w:t>
+            </w:r>
+          </w:p>
+        </w:tc>
+        <w:tc>
+          <w:tcPr>
+            <w:tcW w:w="0" w:type="auto"/>
+            <w:hideMark/>
+          </w:tcPr>
+          <w:p>
+            <w:pPr>
+              <w:spacing w:after="160" w:line="278" w:lineRule="auto"/>
+            </w:pPr>
+            <w:r>
+              <w:t>Név mezőben érvénytelen karakterek</w:t>
+            </w:r>
+          </w:p>
+        </w:tc>
+        <w:tc>
+          <w:tcPr>
+            <w:tcW w:w="0" w:type="auto"/>
+            <w:hideMark/>
+          </w:tcPr>
+          <w:p>
+            <w:pPr>
+              <w:spacing w:after="160" w:line="278" w:lineRule="auto"/>
+            </w:pPr>
+            <w:r>
+              <w:t>Hiba: Nem megfelelő név!</w:t>
+            </w:r>
+          </w:p>
+        </w:tc>
+        <w:tc>
+          <w:tcPr>
+            <w:tcW w:w="0" w:type="auto"/>
+            <w:hideMark/>
+          </w:tcPr>
+          <w:p>
+            <w:pPr>
+              <w:spacing w:after="160" w:line="278" w:lineRule="auto"/>
+            </w:pPr>
+            <w:r>
+              <w:t>OK</w:t>
+            </w:r>
+          </w:p>
+        </w:tc>
+      </w:tr>
+      <w:tr>
+        <w:tc>
+          <w:tcPr>
+            <w:tcW w:w="0" w:type="auto"/>
+            <w:hideMark/>
+          </w:tcPr>
+          <w:p>
+            <w:pPr>
+              <w:spacing w:after="160" w:line="278" w:lineRule="auto"/>
+            </w:pPr>
+            <w:r>
+              <w:t>REG0</w:t>
+            </w:r>
+            <w:r>
+              <w:t>5</w:t>
+            </w:r>
+          </w:p>
+        </w:tc>
+        <w:tc>
+          <w:tcPr>
+            <w:tcW w:w="0" w:type="auto"/>
+            <w:hideMark/>
+          </w:tcPr>
+          <w:p>
+            <w:pPr>
+              <w:spacing w:after="160" w:line="278" w:lineRule="auto"/>
+            </w:pPr>
+            <w:r>
+              <w:t>Emailben hiányzó ’@’ karakter</w:t>
+            </w:r>
+          </w:p>
+        </w:tc>
+        <w:tc>
+          <w:tcPr>
+            <w:tcW w:w="0" w:type="auto"/>
+            <w:hideMark/>
+          </w:tcPr>
+          <w:p>
+            <w:pPr>
+              <w:spacing w:after="160" w:line="278" w:lineRule="auto"/>
+            </w:pPr>
+            <w:r>
+              <w:t>Hiba: Nem megfelelő email cím!</w:t>
+            </w:r>
+          </w:p>
+        </w:tc>
+        <w:tc>
+          <w:tcPr>
+            <w:tcW w:w="0" w:type="auto"/>
+            <w:hideMark/>
+          </w:tcPr>
+          <w:p>
+            <w:pPr>
+              <w:spacing w:after="160" w:line="278" w:lineRule="auto"/>
+            </w:pPr>
+            <w:r>
+              <w:t>OK</w:t>
+            </w:r>
+          </w:p>
+        </w:tc>
+      </w:tr>
+      <w:tr>
+        <w:tc>
+          <w:tcPr>
+            <w:tcW w:w="0" w:type="auto"/>
+            <w:hideMark/>
+          </w:tcPr>
+          <w:p>
+            <w:pPr>
+              <w:spacing w:after="160" w:line="278" w:lineRule="auto"/>
+            </w:pPr>
+            <w:r>
+              <w:t>REG0</w:t>
+            </w:r>
+            <w:r>
+              <w:t>6</w:t>
+            </w:r>
+          </w:p>
+        </w:tc>
+        <w:tc>
+          <w:tcPr>
+            <w:tcW w:w="0" w:type="auto"/>
+            <w:hideMark/>
+          </w:tcPr>
+          <w:p>
+            <w:pPr>
+              <w:spacing w:after="160" w:line="278" w:lineRule="auto"/>
+            </w:pPr>
+            <w:r>
+              <w:t>Email túl sok karaktert tartalmaz.</w:t>
+            </w:r>
+          </w:p>
+        </w:tc>
+        <w:tc>
+          <w:tcPr>
+            <w:tcW w:w="0" w:type="auto"/>
+            <w:hideMark/>
+          </w:tcPr>
+          <w:p>
+            <w:pPr>
+              <w:spacing w:after="160" w:line="278" w:lineRule="auto"/>
+            </w:pPr>
+            <w:r>
+              <w:t>Hiba: Nem megfelelő email cím!</w:t>
+            </w:r>
+          </w:p>
+        </w:tc>
+        <w:tc>
+          <w:tcPr>
+            <w:tcW w:w="0" w:type="auto"/>
+            <w:hideMark/>
+          </w:tcPr>
+          <w:p>
+            <w:pPr>
+              <w:spacing w:after="160" w:line="278" w:lineRule="auto"/>
+            </w:pPr>
+            <w:r>
+              <w:t>OK</w:t>
+            </w:r>
+          </w:p>
+        </w:tc>
+      </w:tr>
+      <w:tr>
+        <w:tc>
+          <w:tcPr>
+            <w:tcW w:w="0" w:type="auto"/>
+            <w:hideMark/>
+          </w:tcPr>
+          <w:p>
+            <w:pPr>
+              <w:spacing w:after="160" w:line="278" w:lineRule="auto"/>
+            </w:pPr>
+            <w:r>
+              <w:t>REG07</w:t>
+            </w:r>
+          </w:p>
+        </w:tc>
+        <w:tc>
+          <w:tcPr>
+            <w:tcW w:w="0" w:type="auto"/>
+            <w:hideMark/>
+          </w:tcPr>
+          <w:p>
+            <w:pPr>
+              <w:spacing w:after="160" w:line="278" w:lineRule="auto"/>
+            </w:pPr>
+            <w:r>
+              <w:t>Karakterek száma. min.: 8 max.: 100.</w:t>
+            </w:r>
+          </w:p>
+        </w:tc>
+        <w:tc>
+          <w:tcPr>
+            <w:tcW w:w="0" w:type="auto"/>
+            <w:hideMark/>
+          </w:tcPr>
+          <w:p>
+            <w:pPr>
+              <w:spacing w:after="160" w:line="278" w:lineRule="auto"/>
+            </w:pPr>
+            <w:r>
+              <w:t>Hiba: A megadott adatok nem megfelelőek!</w:t>
+            </w:r>
+          </w:p>
+        </w:tc>
+        <w:tc>
+          <w:tcPr>
+            <w:tcW w:w="0" w:type="auto"/>
+            <w:hideMark/>
+          </w:tcPr>
+          <w:p>
+            <w:pPr>
+              <w:spacing w:after="160" w:line="278" w:lineRule="auto"/>
+            </w:pPr>
+            <w:r>
+              <w:t>OK</w:t>
+            </w:r>
+          </w:p>
+        </w:tc>
+      </w:tr>
+      <w:tr>
+        <w:tc>
+          <w:tcPr>
+            <w:tcW w:w="0" w:type="auto"/>
+            <w:hideMark/>
+          </w:tcPr>
+          <w:p>
+            <w:pPr>
+              <w:spacing w:after="160" w:line="278" w:lineRule="auto"/>
+            </w:pPr>
+            <w:r>
+              <w:t>Rendelés leadás</w:t>
+            </w:r>
+          </w:p>
+        </w:tc>
+        <w:tc>
+          <w:tcPr>
+            <w:tcW w:w="0" w:type="auto"/>
+            <w:hideMark/>
+          </w:tcPr>
+          <w:p>
+            <w:pPr>
+              <w:spacing w:after="160" w:line="278" w:lineRule="auto"/>
+            </w:pPr>
+            <w:r>
+              <w:t>Checkout</w:t>
+            </w:r>
+          </w:p>
+        </w:tc>
+        <w:tc>
+          <w:tcPr>
+            <w:tcW w:w="0" w:type="auto"/>
+            <w:hideMark/>
+          </w:tcPr>
+          <w:p>
+            <w:pPr>
+              <w:spacing w:after="160" w:line="278" w:lineRule="auto"/>
+            </w:pPr>
+            <w:r>
+              <w:t>Order létrejön DB-ben</w:t>
+            </w:r>
+          </w:p>
+        </w:tc>
+        <w:tc>
+          <w:tcPr>
+            <w:tcW w:w="0" w:type="auto"/>
+            <w:hideMark/>
+          </w:tcPr>
+          <w:p>
+            <w:pPr>
+              <w:spacing w:after="160" w:line="278" w:lineRule="auto"/>
+            </w:pPr>
+            <w:r>
+              <w:t>OK</w:t>
+            </w:r>
+          </w:p>
+        </w:tc>
+      </w:tr>
+      <w:tr>
+        <w:tc>
+          <w:tcPr>
+            <w:tcW w:w="0" w:type="auto"/>
+            <w:hideMark/>
+          </w:tcPr>
+          <w:p>
+            <w:pPr>
+              <w:spacing w:after="160" w:line="278" w:lineRule="auto"/>
+            </w:pPr>
+            <w:r>
+              <w:t>Admin törlés</w:t>
+            </w:r>
+          </w:p>
+        </w:tc>
+        <w:tc>
+          <w:tcPr>
+            <w:tcW w:w="0" w:type="auto"/>
+            <w:hideMark/>
+          </w:tcPr>
+          <w:p>
+            <w:pPr>
+              <w:spacing w:after="160" w:line="278" w:lineRule="auto"/>
+            </w:pPr>
+            <w:r>
+              <w:t>Termék törlése</w:t>
+            </w:r>
+          </w:p>
+        </w:tc>
+        <w:tc>
+          <w:tcPr>
+            <w:tcW w:w="0" w:type="auto"/>
+            <w:hideMark/>
+          </w:tcPr>
+          <w:p>
+            <w:pPr>
+              <w:spacing w:after="160" w:line="278" w:lineRule="auto"/>
+            </w:pPr>
+            <w:r>
+              <w:t>DB-ből eltűnik</w:t>
+            </w:r>
+          </w:p>
+        </w:tc>
+        <w:tc>
+          <w:tcPr>
+            <w:tcW w:w="0" w:type="auto"/>
+            <w:hideMark/>
+          </w:tcPr>
+          <w:p>
+            <w:pPr>
+              <w:spacing w:after="160" w:line="278" w:lineRule="auto"/>
+            </w:pPr>
+            <w:r>
+              <w:t>OK</w:t>
+            </w:r>
+          </w:p>
+        </w:tc>
+      </w:tr>
+      <w:tr>
+        <w:tc>
+          <w:tcPr>
+            <w:tcW w:w="0" w:type="auto"/>
+            <w:hideMark/>
+          </w:tcPr>
+          <w:p>
+            <w:pPr>
+              <w:spacing w:after="160" w:line="278" w:lineRule="auto"/>
+            </w:pPr>
+            <w:r>
+              <w:lastRenderedPageBreak/>
+              <w:t>Token védelem</w:t>
+            </w:r>
+          </w:p>
+        </w:tc>
+        <w:tc>
+          <w:tcPr>
+            <w:tcW w:w="0" w:type="auto"/>
+            <w:hideMark/>
+          </w:tcPr>
+          <w:p>
+            <w:pPr>
+              <w:spacing w:after="160" w:line="278" w:lineRule="auto"/>
+            </w:pPr>
+            <w:r>
+              <w:t>/admin hívás token nélkül</w:t>
+            </w:r>
+          </w:p>
+        </w:tc>
+        <w:tc>
+          <w:tcPr>
+            <w:tcW w:w="0" w:type="auto"/>
+            <w:hideMark/>
+          </w:tcPr>
+          <w:p>
+            <w:pPr>
+              <w:spacing w:after="160" w:line="278" w:lineRule="auto"/>
+            </w:pPr>
+            <w:r>
+              <w:t>401 hiba</w:t>
+            </w:r>
+          </w:p>
+        </w:tc>
+        <w:tc>
+          <w:tcPr>
+            <w:tcW w:w="0" w:type="auto"/>
+            <w:hideMark/>
+          </w:tcPr>
+          <w:p>
+            <w:pPr>
+              <w:spacing w:after="160" w:line="278" w:lineRule="auto"/>
+            </w:pPr>
+            <w:r>
+              <w:t>OK</w:t>
+            </w:r>
+          </w:p>
+        </w:tc>
+      </w:tr>
+    </w:tbl>
     <w:p/>
     <w:p/>
     <w:sectPr>
@@ -1308,6 +2043,7 @@
   <w:style w:type="paragraph" w:default="1" w:styleId="Norml">
     <w:name w:val="Normal"/>
     <w:qFormat/>
+    <w:rsid w:val="00200FEE"/>
   </w:style>
   <w:style w:type="paragraph" w:styleId="Cmsor1">
     <w:name w:val="heading 1"/>

</xml_diff>